<commit_message>
Lab 3 - Update report
</commit_message>
<xml_diff>
--- a/lab3/22672071_LeTanPhong_Lab3_Report.docx
+++ b/lab3/22672071_LeTanPhong_Lab3_Report.docx
@@ -1,6 +1,6 @@
 
 <file path=word/document.xml><?xml version="1.0" encoding="utf-8"?>
-<w:document xmlns:wpc="http://schemas.microsoft.com/office/word/2010/wordprocessingCanvas" xmlns:cx="http://schemas.microsoft.com/office/drawing/2014/chartex" xmlns:cx1="http://schemas.microsoft.com/office/drawing/2015/9/8/chartex" xmlns:cx2="http://schemas.microsoft.com/office/drawing/2015/10/21/chartex" xmlns:cx3="http://schemas.microsoft.com/office/drawing/2016/5/9/chartex" xmlns:cx4="http://schemas.microsoft.com/office/drawing/2016/5/10/chartex" xmlns:cx5="http://schemas.microsoft.com/office/drawing/2016/5/11/chartex" xmlns:cx6="http://schemas.microsoft.com/office/drawing/2016/5/12/chartex" xmlns:cx7="http://schemas.microsoft.com/office/drawing/2016/5/13/chartex" xmlns:cx8="http://schemas.microsoft.com/office/drawing/2016/5/14/chartex" xmlns:mc="http://schemas.openxmlformats.org/markup-compatibility/2006" xmlns:aink="http://schemas.microsoft.com/office/drawing/2016/ink" xmlns:am3d="http://schemas.microsoft.com/office/drawing/2017/model3d" xmlns:o="urn:schemas-microsoft-com:office:office" xmlns:oel="http://schemas.microsoft.com/office/2019/extlst" xmlns:r="http://schemas.openxmlformats.org/officeDocument/2006/relationships" xmlns:m="http://schemas.openxmlformats.org/officeDocument/2006/math" xmlns:v="urn:schemas-microsoft-com:vml" xmlns:wp14="http://schemas.microsoft.com/office/word/2010/wordprocessingDrawing" xmlns:wp="http://schemas.openxmlformats.org/drawingml/2006/wordprocessingDrawing" xmlns:w10="urn:schemas-microsoft-com:office:word" xmlns:w="http://schemas.openxmlformats.org/wordprocessingml/2006/main" xmlns:w14="http://schemas.microsoft.com/office/word/2010/wordml" xmlns:w15="http://schemas.microsoft.com/office/word/2012/wordml" xmlns:w16cex="http://schemas.microsoft.com/office/word/2018/wordml/cex" xmlns:w16cid="http://schemas.microsoft.com/office/word/2016/wordml/cid" xmlns:w16="http://schemas.microsoft.com/office/word/2018/wordml" xmlns:w16du="http://schemas.microsoft.com/office/word/2023/wordml/word16du" xmlns:w16sdtdh="http://schemas.microsoft.com/office/word/2020/wordml/sdtdatahash" xmlns:w16sdtfl="http://schemas.microsoft.com/office/word/2024/wordml/sdtformatlock" xmlns:w16se="http://schemas.microsoft.com/office/word/2015/wordml/symex" xmlns:wpg="http://schemas.microsoft.com/office/word/2010/wordprocessingGroup" xmlns:wpi="http://schemas.microsoft.com/office/word/2010/wordprocessingInk" xmlns:wne="http://schemas.microsoft.com/office/word/2006/wordml" xmlns:wps="http://schemas.microsoft.com/office/word/2010/wordprocessingShape" mc:Ignorable="w14 w15 w16se w16cid w16 w16cex w16sdtdh w16sdtfl w16du wp14">
+<w:document xmlns:wpc="http://schemas.microsoft.com/office/word/2010/wordprocessingCanvas" xmlns:mc="http://schemas.openxmlformats.org/markup-compatibility/2006" xmlns:o="urn:schemas-microsoft-com:office:office" xmlns:r="http://schemas.openxmlformats.org/officeDocument/2006/relationships" xmlns:m="http://schemas.openxmlformats.org/officeDocument/2006/math" xmlns:v="urn:schemas-microsoft-com:vml" xmlns:wp14="http://schemas.microsoft.com/office/word/2010/wordprocessingDrawing" xmlns:wp="http://schemas.openxmlformats.org/drawingml/2006/wordprocessingDrawing" xmlns:w10="urn:schemas-microsoft-com:office:word" xmlns:w="http://schemas.openxmlformats.org/wordprocessingml/2006/main" xmlns:w14="http://schemas.microsoft.com/office/word/2010/wordml" xmlns:w15="http://schemas.microsoft.com/office/word/2012/wordml" xmlns:wpg="http://schemas.microsoft.com/office/word/2010/wordprocessingGroup" xmlns:wpi="http://schemas.microsoft.com/office/word/2010/wordprocessingInk" xmlns:wne="http://schemas.microsoft.com/office/word/2006/wordml" xmlns:wps="http://schemas.microsoft.com/office/word/2010/wordprocessingShape" mc:Ignorable="w14 w15 wp14">
   <w:body>
     <w:p>
       <w:pPr>
@@ -9,12 +9,21 @@
           <w:sz w:val="24"/>
         </w:rPr>
       </w:pPr>
-      <w:r>
-        <w:rPr>
-          <w:rFonts w:ascii="Times New Roman" w:hAnsi="Times New Roman" w:cs="Times New Roman"/>
-          <w:sz w:val="24"/>
-        </w:rPr>
-        <w:t>Mssv: 22672071</w:t>
+      <w:proofErr w:type="spellStart"/>
+      <w:r>
+        <w:rPr>
+          <w:rFonts w:ascii="Times New Roman" w:hAnsi="Times New Roman" w:cs="Times New Roman"/>
+          <w:sz w:val="24"/>
+        </w:rPr>
+        <w:t>Mssv</w:t>
+      </w:r>
+      <w:proofErr w:type="spellEnd"/>
+      <w:r>
+        <w:rPr>
+          <w:rFonts w:ascii="Times New Roman" w:hAnsi="Times New Roman" w:cs="Times New Roman"/>
+          <w:sz w:val="24"/>
+        </w:rPr>
+        <w:t>: 22672071</w:t>
       </w:r>
     </w:p>
     <w:p>
@@ -24,13 +33,47 @@
           <w:sz w:val="24"/>
         </w:rPr>
       </w:pPr>
-      <w:r>
-        <w:rPr>
-          <w:rFonts w:ascii="Times New Roman" w:hAnsi="Times New Roman" w:cs="Times New Roman"/>
-          <w:sz w:val="24"/>
-        </w:rPr>
-        <w:t>Họ và tên</w:t>
-      </w:r>
+      <w:proofErr w:type="spellStart"/>
+      <w:r>
+        <w:rPr>
+          <w:rFonts w:ascii="Times New Roman" w:hAnsi="Times New Roman" w:cs="Times New Roman"/>
+          <w:sz w:val="24"/>
+        </w:rPr>
+        <w:t>Họ</w:t>
+      </w:r>
+      <w:proofErr w:type="spellEnd"/>
+      <w:r>
+        <w:rPr>
+          <w:rFonts w:ascii="Times New Roman" w:hAnsi="Times New Roman" w:cs="Times New Roman"/>
+          <w:sz w:val="24"/>
+        </w:rPr>
+        <w:t xml:space="preserve"> </w:t>
+      </w:r>
+      <w:proofErr w:type="spellStart"/>
+      <w:r>
+        <w:rPr>
+          <w:rFonts w:ascii="Times New Roman" w:hAnsi="Times New Roman" w:cs="Times New Roman"/>
+          <w:sz w:val="24"/>
+        </w:rPr>
+        <w:t>và</w:t>
+      </w:r>
+      <w:proofErr w:type="spellEnd"/>
+      <w:r>
+        <w:rPr>
+          <w:rFonts w:ascii="Times New Roman" w:hAnsi="Times New Roman" w:cs="Times New Roman"/>
+          <w:sz w:val="24"/>
+        </w:rPr>
+        <w:t xml:space="preserve"> </w:t>
+      </w:r>
+      <w:proofErr w:type="spellStart"/>
+      <w:r>
+        <w:rPr>
+          <w:rFonts w:ascii="Times New Roman" w:hAnsi="Times New Roman" w:cs="Times New Roman"/>
+          <w:sz w:val="24"/>
+        </w:rPr>
+        <w:t>tên</w:t>
+      </w:r>
+      <w:proofErr w:type="spellEnd"/>
       <w:r>
         <w:rPr>
           <w:rFonts w:ascii="Times New Roman" w:hAnsi="Times New Roman" w:cs="Times New Roman"/>
@@ -38,13 +81,47 @@
         </w:rPr>
         <w:t xml:space="preserve">: </w:t>
       </w:r>
-      <w:r>
-        <w:rPr>
-          <w:rFonts w:ascii="Times New Roman" w:hAnsi="Times New Roman" w:cs="Times New Roman"/>
-          <w:sz w:val="24"/>
-        </w:rPr>
-        <w:t>Lê Tấn Phong</w:t>
-      </w:r>
+      <w:proofErr w:type="spellStart"/>
+      <w:r>
+        <w:rPr>
+          <w:rFonts w:ascii="Times New Roman" w:hAnsi="Times New Roman" w:cs="Times New Roman"/>
+          <w:sz w:val="24"/>
+        </w:rPr>
+        <w:t>Lê</w:t>
+      </w:r>
+      <w:proofErr w:type="spellEnd"/>
+      <w:r>
+        <w:rPr>
+          <w:rFonts w:ascii="Times New Roman" w:hAnsi="Times New Roman" w:cs="Times New Roman"/>
+          <w:sz w:val="24"/>
+        </w:rPr>
+        <w:t xml:space="preserve"> </w:t>
+      </w:r>
+      <w:proofErr w:type="spellStart"/>
+      <w:r>
+        <w:rPr>
+          <w:rFonts w:ascii="Times New Roman" w:hAnsi="Times New Roman" w:cs="Times New Roman"/>
+          <w:sz w:val="24"/>
+        </w:rPr>
+        <w:t>Tấn</w:t>
+      </w:r>
+      <w:proofErr w:type="spellEnd"/>
+      <w:r>
+        <w:rPr>
+          <w:rFonts w:ascii="Times New Roman" w:hAnsi="Times New Roman" w:cs="Times New Roman"/>
+          <w:sz w:val="24"/>
+        </w:rPr>
+        <w:t xml:space="preserve"> </w:t>
+      </w:r>
+      <w:proofErr w:type="spellStart"/>
+      <w:r>
+        <w:rPr>
+          <w:rFonts w:ascii="Times New Roman" w:hAnsi="Times New Roman" w:cs="Times New Roman"/>
+          <w:sz w:val="24"/>
+        </w:rPr>
+        <w:t>Phong</w:t>
+      </w:r>
+      <w:proofErr w:type="spellEnd"/>
     </w:p>
     <w:p>
       <w:pPr>
@@ -74,7 +151,23 @@
           <w:rFonts w:ascii="Times New Roman" w:hAnsi="Times New Roman" w:cs="Times New Roman"/>
           <w:sz w:val="24"/>
         </w:rPr>
-        <w:t xml:space="preserve">Link github: </w:t>
+        <w:t xml:space="preserve">Link </w:t>
+      </w:r>
+      <w:proofErr w:type="spellStart"/>
+      <w:r>
+        <w:rPr>
+          <w:rFonts w:ascii="Times New Roman" w:hAnsi="Times New Roman" w:cs="Times New Roman"/>
+          <w:sz w:val="24"/>
+        </w:rPr>
+        <w:t>github</w:t>
+      </w:r>
+      <w:proofErr w:type="spellEnd"/>
+      <w:r>
+        <w:rPr>
+          <w:rFonts w:ascii="Times New Roman" w:hAnsi="Times New Roman" w:cs="Times New Roman"/>
+          <w:sz w:val="24"/>
+        </w:rPr>
+        <w:t xml:space="preserve">: </w:t>
       </w:r>
       <w:hyperlink r:id="rId4" w:history="1">
         <w:r>
@@ -154,14 +247,13 @@
       <w:r>
         <w:rPr>
           <w:rFonts w:ascii="Times New Roman" w:hAnsi="Times New Roman" w:cs="Times New Roman"/>
-          <w:noProof/>
           <w:sz w:val="24"/>
         </w:rPr>
         <w:drawing>
-          <wp:inline distT="0" distB="0" distL="0" distR="0" wp14:anchorId="6A18E87F" wp14:editId="589C3344">
-            <wp:extent cx="5943600" cy="3183255"/>
+          <wp:inline distT="0" distB="0" distL="0" distR="0" wp14:anchorId="78603DFE" wp14:editId="30F6997A">
+            <wp:extent cx="5943600" cy="3222625"/>
             <wp:effectExtent l="0" t="0" r="0" b="0"/>
-            <wp:docPr id="2" name="Picture 2"/>
+            <wp:docPr id="8" name="Picture 8"/>
             <wp:cNvGraphicFramePr>
               <a:graphicFrameLocks xmlns:a="http://schemas.openxmlformats.org/drawingml/2006/main" noChangeAspect="1"/>
             </wp:cNvGraphicFramePr>
@@ -181,7 +273,7 @@
                   <pic:spPr>
                     <a:xfrm>
                       <a:off x="0" y="0"/>
-                      <a:ext cx="5943600" cy="3183255"/>
+                      <a:ext cx="5943600" cy="3222625"/>
                     </a:xfrm>
                     <a:prstGeom prst="rect">
                       <a:avLst/>
@@ -204,15 +296,14 @@
       <w:r>
         <w:rPr>
           <w:rFonts w:ascii="Times New Roman" w:hAnsi="Times New Roman" w:cs="Times New Roman"/>
-          <w:noProof/>
           <w:sz w:val="24"/>
         </w:rPr>
         <w:lastRenderedPageBreak/>
         <w:drawing>
-          <wp:inline distT="0" distB="0" distL="0" distR="0" wp14:anchorId="7B679D74" wp14:editId="51105E9B">
-            <wp:extent cx="5943600" cy="3205480"/>
-            <wp:effectExtent l="0" t="0" r="0" b="0"/>
-            <wp:docPr id="3" name="Picture 3"/>
+          <wp:inline distT="0" distB="0" distL="0" distR="0" wp14:anchorId="0076566E" wp14:editId="0787680A">
+            <wp:extent cx="5943600" cy="3209925"/>
+            <wp:effectExtent l="0" t="0" r="0" b="9525"/>
+            <wp:docPr id="9" name="Picture 9"/>
             <wp:cNvGraphicFramePr>
               <a:graphicFrameLocks xmlns:a="http://schemas.openxmlformats.org/drawingml/2006/main" noChangeAspect="1"/>
             </wp:cNvGraphicFramePr>
@@ -232,7 +323,7 @@
                   <pic:spPr>
                     <a:xfrm>
                       <a:off x="0" y="0"/>
-                      <a:ext cx="5943600" cy="3205480"/>
+                      <a:ext cx="5943600" cy="3209925"/>
                     </a:xfrm>
                     <a:prstGeom prst="rect">
                       <a:avLst/>
@@ -255,14 +346,13 @@
       <w:r>
         <w:rPr>
           <w:rFonts w:ascii="Times New Roman" w:hAnsi="Times New Roman" w:cs="Times New Roman"/>
-          <w:noProof/>
           <w:sz w:val="24"/>
         </w:rPr>
         <w:drawing>
-          <wp:inline distT="0" distB="0" distL="0" distR="0" wp14:anchorId="7C0A36B3" wp14:editId="2EE15B6D">
-            <wp:extent cx="5943600" cy="3198495"/>
-            <wp:effectExtent l="0" t="0" r="0" b="1905"/>
-            <wp:docPr id="4" name="Picture 4"/>
+          <wp:inline distT="0" distB="0" distL="0" distR="0" wp14:anchorId="47830A2C" wp14:editId="129FDE64">
+            <wp:extent cx="5943600" cy="3219450"/>
+            <wp:effectExtent l="0" t="0" r="0" b="0"/>
+            <wp:docPr id="10" name="Picture 10"/>
             <wp:cNvGraphicFramePr>
               <a:graphicFrameLocks xmlns:a="http://schemas.openxmlformats.org/drawingml/2006/main" noChangeAspect="1"/>
             </wp:cNvGraphicFramePr>
@@ -282,7 +372,7 @@
                   <pic:spPr>
                     <a:xfrm>
                       <a:off x="0" y="0"/>
-                      <a:ext cx="5943600" cy="3198495"/>
+                      <a:ext cx="5943600" cy="3219450"/>
                     </a:xfrm>
                     <a:prstGeom prst="rect">
                       <a:avLst/>
@@ -305,15 +395,14 @@
       <w:r>
         <w:rPr>
           <w:rFonts w:ascii="Times New Roman" w:hAnsi="Times New Roman" w:cs="Times New Roman"/>
-          <w:noProof/>
           <w:sz w:val="24"/>
         </w:rPr>
         <w:lastRenderedPageBreak/>
         <w:drawing>
-          <wp:inline distT="0" distB="0" distL="0" distR="0" wp14:anchorId="167D3BBE" wp14:editId="5D69A503">
-            <wp:extent cx="5943600" cy="3190875"/>
-            <wp:effectExtent l="0" t="0" r="0" b="9525"/>
-            <wp:docPr id="5" name="Picture 5"/>
+          <wp:inline distT="0" distB="0" distL="0" distR="0" wp14:anchorId="55B8B819" wp14:editId="55093989">
+            <wp:extent cx="5943600" cy="3219450"/>
+            <wp:effectExtent l="0" t="0" r="0" b="0"/>
+            <wp:docPr id="11" name="Picture 11"/>
             <wp:cNvGraphicFramePr>
               <a:graphicFrameLocks xmlns:a="http://schemas.openxmlformats.org/drawingml/2006/main" noChangeAspect="1"/>
             </wp:cNvGraphicFramePr>
@@ -333,7 +422,7 @@
                   <pic:spPr>
                     <a:xfrm>
                       <a:off x="0" y="0"/>
-                      <a:ext cx="5943600" cy="3190875"/>
+                      <a:ext cx="5943600" cy="3219450"/>
                     </a:xfrm>
                     <a:prstGeom prst="rect">
                       <a:avLst/>
@@ -356,14 +445,13 @@
       <w:r>
         <w:rPr>
           <w:rFonts w:ascii="Times New Roman" w:hAnsi="Times New Roman" w:cs="Times New Roman"/>
-          <w:noProof/>
           <w:sz w:val="24"/>
         </w:rPr>
         <w:drawing>
-          <wp:inline distT="0" distB="0" distL="0" distR="0" wp14:anchorId="38EC5EC0" wp14:editId="5EFBAC7D">
-            <wp:extent cx="5943600" cy="3194685"/>
-            <wp:effectExtent l="0" t="0" r="0" b="5715"/>
-            <wp:docPr id="6" name="Picture 6"/>
+          <wp:inline distT="0" distB="0" distL="0" distR="0" wp14:anchorId="0DFC53A3" wp14:editId="190DFBF1">
+            <wp:extent cx="5943600" cy="3219450"/>
+            <wp:effectExtent l="0" t="0" r="0" b="0"/>
+            <wp:docPr id="12" name="Picture 12"/>
             <wp:cNvGraphicFramePr>
               <a:graphicFrameLocks xmlns:a="http://schemas.openxmlformats.org/drawingml/2006/main" noChangeAspect="1"/>
             </wp:cNvGraphicFramePr>
@@ -383,7 +471,7 @@
                   <pic:spPr>
                     <a:xfrm>
                       <a:off x="0" y="0"/>
-                      <a:ext cx="5943600" cy="3194685"/>
+                      <a:ext cx="5943600" cy="3219450"/>
                     </a:xfrm>
                     <a:prstGeom prst="rect">
                       <a:avLst/>
@@ -406,15 +494,14 @@
       <w:r>
         <w:rPr>
           <w:rFonts w:ascii="Times New Roman" w:hAnsi="Times New Roman" w:cs="Times New Roman"/>
-          <w:noProof/>
           <w:sz w:val="24"/>
         </w:rPr>
         <w:lastRenderedPageBreak/>
         <w:drawing>
-          <wp:inline distT="0" distB="0" distL="0" distR="0" wp14:anchorId="78150ED9" wp14:editId="5AE79A0F">
-            <wp:extent cx="5943600" cy="3194685"/>
-            <wp:effectExtent l="0" t="0" r="0" b="5715"/>
-            <wp:docPr id="7" name="Picture 7"/>
+          <wp:inline distT="0" distB="0" distL="0" distR="0" wp14:anchorId="28D16F9E" wp14:editId="0E9B5D0B">
+            <wp:extent cx="5943600" cy="3222625"/>
+            <wp:effectExtent l="0" t="0" r="0" b="0"/>
+            <wp:docPr id="13" name="Picture 13"/>
             <wp:cNvGraphicFramePr>
               <a:graphicFrameLocks xmlns:a="http://schemas.openxmlformats.org/drawingml/2006/main" noChangeAspect="1"/>
             </wp:cNvGraphicFramePr>
@@ -434,7 +521,7 @@
                   <pic:spPr>
                     <a:xfrm>
                       <a:off x="0" y="0"/>
-                      <a:ext cx="5943600" cy="3194685"/>
+                      <a:ext cx="5943600" cy="3222625"/>
                     </a:xfrm>
                     <a:prstGeom prst="rect">
                       <a:avLst/>
@@ -446,6 +533,8 @@
           </wp:inline>
         </w:drawing>
       </w:r>
+      <w:bookmarkStart w:id="0" w:name="_GoBack"/>
+      <w:bookmarkEnd w:id="0"/>
     </w:p>
     <w:p/>
     <w:sectPr>
@@ -459,7 +548,7 @@
 </file>
 
 <file path=word/styles.xml><?xml version="1.0" encoding="utf-8"?>
-<w:styles xmlns:mc="http://schemas.openxmlformats.org/markup-compatibility/2006" xmlns:r="http://schemas.openxmlformats.org/officeDocument/2006/relationships" xmlns:w="http://schemas.openxmlformats.org/wordprocessingml/2006/main" xmlns:w14="http://schemas.microsoft.com/office/word/2010/wordml" xmlns:w15="http://schemas.microsoft.com/office/word/2012/wordml" xmlns:w16cex="http://schemas.microsoft.com/office/word/2018/wordml/cex" xmlns:w16cid="http://schemas.microsoft.com/office/word/2016/wordml/cid" xmlns:w16="http://schemas.microsoft.com/office/word/2018/wordml" xmlns:w16du="http://schemas.microsoft.com/office/word/2023/wordml/word16du" xmlns:w16sdtdh="http://schemas.microsoft.com/office/word/2020/wordml/sdtdatahash" xmlns:w16sdtfl="http://schemas.microsoft.com/office/word/2024/wordml/sdtformatlock" xmlns:w16se="http://schemas.microsoft.com/office/word/2015/wordml/symex" mc:Ignorable="w14 w15 w16se w16cid w16 w16cex w16sdtdh w16sdtfl w16du">
+<w:styles xmlns:mc="http://schemas.openxmlformats.org/markup-compatibility/2006" xmlns:r="http://schemas.openxmlformats.org/officeDocument/2006/relationships" xmlns:w="http://schemas.openxmlformats.org/wordprocessingml/2006/main" xmlns:w14="http://schemas.microsoft.com/office/word/2010/wordml" xmlns:w15="http://schemas.microsoft.com/office/word/2012/wordml" mc:Ignorable="w14 w15">
   <w:docDefaults>
     <w:rPrDefault>
       <w:rPr>
@@ -475,7 +564,7 @@
       </w:pPr>
     </w:pPrDefault>
   </w:docDefaults>
-  <w:latentStyles w:defLockedState="0" w:defUIPriority="99" w:defSemiHidden="0" w:defUnhideWhenUsed="0" w:defQFormat="0" w:count="376">
+  <w:latentStyles w:defLockedState="0" w:defUIPriority="99" w:defSemiHidden="0" w:defUnhideWhenUsed="0" w:defQFormat="0" w:count="371">
     <w:lsdException w:name="Normal" w:uiPriority="0" w:qFormat="1"/>
     <w:lsdException w:name="heading 1" w:uiPriority="9" w:qFormat="1"/>
     <w:lsdException w:name="heading 2" w:semiHidden="1" w:uiPriority="9" w:unhideWhenUsed="1" w:qFormat="1"/>
@@ -847,11 +936,6 @@
     <w:lsdException w:name="List Table 5 Dark Accent 6" w:uiPriority="50"/>
     <w:lsdException w:name="List Table 6 Colorful Accent 6" w:uiPriority="51"/>
     <w:lsdException w:name="List Table 7 Colorful Accent 6" w:uiPriority="52"/>
-    <w:lsdException w:name="Mention" w:semiHidden="1" w:unhideWhenUsed="1"/>
-    <w:lsdException w:name="Smart Hyperlink" w:semiHidden="1" w:unhideWhenUsed="1"/>
-    <w:lsdException w:name="Hashtag" w:semiHidden="1" w:unhideWhenUsed="1"/>
-    <w:lsdException w:name="Unresolved Mention" w:semiHidden="1" w:unhideWhenUsed="1"/>
-    <w:lsdException w:name="Smart Link" w:semiHidden="1" w:unhideWhenUsed="1"/>
   </w:latentStyles>
   <w:style w:type="paragraph" w:default="1" w:styleId="Normal">
     <w:name w:val="Normal"/>

</xml_diff>